<commit_message>
docs: update launch document with new features
- Updated Executive Summary with new roles (Data Scientist, SRF)
- Updated Login Page description with Apple-inspired design
- Updated Coordinator features with LMS progress, quarterly reports, case review
- Added Data Scientist Interface section
- Added SRF Interface section with review workflow
- Updated Director and Admin sections
- Added Version 2.0 history with all new features
</commit_message>
<xml_diff>
--- a/MDRF-MLRF_Connect_Platform_Launch_Document.docx
+++ b/MDRF-MLRF_Connect_Platform_Launch_Document.docx
@@ -129,10 +129,7 @@
         <w:spacing w:after="120"/>
       </w:pPr>
       <w:r>
-        <w:rPr>
-          <w:color w:val="333333"/>
-        </w:rPr>
-        <w:t>The MDRF/MLRF Connect platform is a secure, web-based dashboard system developed for the Meghalaya Research Fellows program. It provides role-specific interfaces for Fellows, Coordinators, Directors, and Administrators to streamline field research management, log submissions, compliance tracking, and program oversight.</w:t>
+        <w:t>The MDRF/MLRF Connect platform is a secure, web-based dashboard system developed for the Meghalaya Research Fellows program. It provides role-specific interfaces for Fellows, Data Scientists, Senior Research Fellows (SRF), Coordinators, Directors, and Administrators to streamline field research management, log submissions, compliance tracking, and cross-team collaboration.</w:t>
       </w:r>
     </w:p>
     <w:p>
@@ -188,10 +185,7 @@
         <w:spacing w:after="120"/>
       </w:pPr>
       <w:r>
-        <w:rPr>
-          <w:color w:val="333333"/>
-        </w:rPr>
-        <w:t>Built with modern web technologies (Next.js 14, TypeScript, Tailwind CSS, Firebase), the platform delivers a responsive, mobile-friendly experience with a professional navy-and-gold design language. All user interfaces have been designed to eliminate friction, with clear visual hierarchy, accessible typography, and context-appropriate navigation.</w:t>
+        <w:t>Built with modern web technologies (Next.js 14, TypeScript, Tailwind CSS, Firebase), the platform delivers a responsive, mobile-friendly experience with role-based theming — each role has a unique color identity. All user interfaces have been designed to eliminate friction, with clear visual hierarchy, accessible contrast ratios, and Apple-inspired design principles.</w:t>
       </w:r>
     </w:p>
     <w:p>
@@ -199,30 +193,7 @@
         <w:spacing w:after="120"/>
       </w:pPr>
       <w:r>
-        <w:rPr>
-          <w:color w:val="333333"/>
-        </w:rPr>
-        <w:t>The platform includes key features such as</w:t>
-      </w:r>
-      <w:r>
-        <w:rPr>
-          <w:color w:val="333333"/>
-        </w:rPr>
-        <w:t xml:space="preserve">: </w:t>
-      </w:r>
-      <w:proofErr w:type="spellStart"/>
-      <w:r>
-        <w:rPr>
-          <w:color w:val="333333"/>
-        </w:rPr>
-        <w:t>Firestore</w:t>
-      </w:r>
-      <w:proofErr w:type="spellEnd"/>
-      <w:r>
-        <w:rPr>
-          <w:color w:val="333333"/>
-        </w:rPr>
-        <w:t xml:space="preserve"> offline persistence for remote field areas, split activity/output logging, support request escalation, voice-to-text input, configurable LMS course links, and comprehensive coordinator alerting.</w:t>
+        <w:t>The platform includes key features such as: ISB OneDrive integration for document uploads, quarterly report generation (DOCX format), notification system for cross-role communication, case study review workflow with SRF approval, coordinator LMS progress tracking, Firestore offline persistence for remote field areas, and comprehensive role-based alerting.</w:t>
       </w:r>
     </w:p>
     <w:p>
@@ -1331,63 +1302,13 @@
         <w:spacing w:after="120"/>
       </w:pPr>
       <w:r>
-        <w:rPr>
-          <w:color w:val="333333"/>
-        </w:rPr>
-        <w:t>The login page features a split layout with a branded hero panel (navy background with animated gradient orbs, geometric decorations, and Meghalaya hill silhouette) and a sign-in card with Google OAuth. Fully responsive for mobile with scrollable layout.</w:t>
+        <w:t>The login page features an Apple-inspired split layout with a dark animated hero panel (floating orbs, geometric shapes, subtle grid background) and a clean white sign-in card. Supports email OTP and Google OAuth. Role-based theming applies unique colors to each user's dashboard experience.</w:t>
       </w:r>
     </w:p>
     <w:p>
       <w:pPr>
         <w:spacing w:before="200" w:after="60"/>
-        <w:jc w:val="center"/>
-      </w:pPr>
-      <w:r>
-        <w:rPr>
-          <w:noProof/>
-        </w:rPr>
-        <w:drawing>
-          <wp:inline distT="0" distB="0" distL="0" distR="0" wp14:anchorId="565570A7" wp14:editId="728F05C8">
-            <wp:extent cx="6368902" cy="3469520"/>
-            <wp:effectExtent l="0" t="0" r="0" b="0"/>
-            <wp:docPr id="1089022792" name="Picture 1"/>
-            <wp:cNvGraphicFramePr>
-              <a:graphicFrameLocks xmlns:a="http://schemas.openxmlformats.org/drawingml/2006/main" noChangeAspect="1"/>
-            </wp:cNvGraphicFramePr>
-            <a:graphic xmlns:a="http://schemas.openxmlformats.org/drawingml/2006/main">
-              <a:graphicData uri="http://schemas.openxmlformats.org/drawingml/2006/picture">
-                <pic:pic xmlns:pic="http://schemas.openxmlformats.org/drawingml/2006/picture">
-                  <pic:nvPicPr>
-                    <pic:cNvPr id="1089022792" name="Picture 1089022792"/>
-                    <pic:cNvPicPr/>
-                  </pic:nvPicPr>
-                  <pic:blipFill>
-                    <a:blip r:embed="rId7" cstate="print">
-                      <a:extLst>
-                        <a:ext uri="{28A0092B-C50C-407E-A947-70E740481C1C}">
-                          <a14:useLocalDpi xmlns:a14="http://schemas.microsoft.com/office/drawing/2010/main" val="0"/>
-                        </a:ext>
-                      </a:extLst>
-                    </a:blip>
-                    <a:stretch>
-                      <a:fillRect/>
-                    </a:stretch>
-                  </pic:blipFill>
-                  <pic:spPr>
-                    <a:xfrm>
-                      <a:off x="0" y="0"/>
-                      <a:ext cx="6378427" cy="3474709"/>
-                    </a:xfrm>
-                    <a:prstGeom prst="rect">
-                      <a:avLst/>
-                    </a:prstGeom>
-                  </pic:spPr>
-                </pic:pic>
-              </a:graphicData>
-            </a:graphic>
-          </wp:inline>
-        </w:drawing>
-      </w:r>
+      </w:pPr>
     </w:p>
     <w:p>
       <w:pPr>
@@ -2424,24 +2345,7 @@
         <w:spacing w:after="120"/>
       </w:pPr>
       <w:r>
-        <w:rPr>
-          <w:color w:val="333333"/>
-        </w:rPr>
-        <w:t xml:space="preserve">The </w:t>
-      </w:r>
-      <w:proofErr w:type="gramStart"/>
-      <w:r>
-        <w:rPr>
-          <w:color w:val="333333"/>
-        </w:rPr>
-        <w:t>Coordinator</w:t>
-      </w:r>
-      <w:proofErr w:type="gramEnd"/>
-      <w:r>
-        <w:rPr>
-          <w:color w:val="333333"/>
-        </w:rPr>
-        <w:t xml:space="preserve"> dashboard provides oversight for assigned fellows:</w:t>
+        <w:t>The Coordinator dashboard provides comprehensive oversight for program fellows:</w:t>
       </w:r>
     </w:p>
     <w:p>
@@ -2579,10 +2483,7 @@
         <w:spacing w:after="120"/>
       </w:pPr>
       <w:r>
-        <w:rPr>
-          <w:color w:val="333333"/>
-        </w:rPr>
-        <w:t>Directors have program-wide visibility:</w:t>
+        <w:t>Directors have program-wide visibility across both MDRF and MLRF programs:</w:t>
       </w:r>
     </w:p>
     <w:p>
@@ -2684,10 +2585,7 @@
         <w:spacing w:after="120"/>
       </w:pPr>
       <w:r>
-        <w:rPr>
-          <w:color w:val="333333"/>
-        </w:rPr>
-        <w:t>Administrators manage the platform:</w:t>
+        <w:t>Administrators manage the entire platform:</w:t>
       </w:r>
     </w:p>
     <w:p>
@@ -3394,24 +3292,7 @@
         <w:spacing w:after="120"/>
       </w:pPr>
       <w:r>
-        <w:rPr>
-          <w:color w:val="333333"/>
-        </w:rPr>
-        <w:t>The platform uses role-based navigation configured in nav-</w:t>
-      </w:r>
-      <w:proofErr w:type="spellStart"/>
-      <w:r>
-        <w:rPr>
-          <w:color w:val="333333"/>
-        </w:rPr>
-        <w:t>config.tsx</w:t>
-      </w:r>
-      <w:proofErr w:type="spellEnd"/>
-      <w:r>
-        <w:rPr>
-          <w:color w:val="333333"/>
-        </w:rPr>
-        <w:t>. The desktop sidebar provides full navigation while a mobile bottom nav bar offers quick access to key sections. An "ISB LMS" link is available to all roles.</w:t>
+        <w:t>The platform uses role-based navigation configured in nav-config.tsx. Each role has a unique sidebar color theme. The desktop sidebar provides full navigation while a mobile bottom nav bar offers quick access to key sections. Role-specific features include:</w:t>
       </w:r>
     </w:p>
     <w:p>
@@ -3427,10 +3308,7 @@
         <w:spacing w:after="120"/>
       </w:pPr>
       <w:r>
-        <w:rPr>
-          <w:color w:val="333333"/>
-        </w:rPr>
-        <w:t>Authentication is handled entirely by Firebase Auth with Google OAuth. No passwords are stored in the application database.</w:t>
+        <w:t>Authentication is handled by Firebase Auth with email OTP (passwordless) and Google OAuth. No passwords are stored in the application database.</w:t>
       </w:r>
     </w:p>
     <w:p>
@@ -4016,6 +3894,459 @@
           <w:color w:val="666666"/>
         </w:rPr>
         <w:t>— End of Document —</w:t>
+      </w:r>
+    </w:p>
+    <w:p>
+      <w:pPr>
+        <w:pStyle w:val="ListParagraph"/>
+      </w:pPr>
+      <w:r>
+        <w:t>District/constituency overview with compliance metrics</w:t>
+      </w:r>
+    </w:p>
+    <w:p>
+      <w:pPr>
+        <w:pStyle w:val="ListParagraph"/>
+      </w:pPr>
+      <w:r>
+        <w:t>Alerts panel: silent fellows (3-day inactivity threshold), stuck tasks, urgent support requests, overdue deliverables</w:t>
+      </w:r>
+    </w:p>
+    <w:p>
+      <w:pPr>
+        <w:pStyle w:val="ListParagraph"/>
+      </w:pPr>
+      <w:r>
+        <w:t>Support request triage with program-scoped filtering</w:t>
+      </w:r>
+    </w:p>
+    <w:p>
+      <w:pPr>
+        <w:pStyle w:val="ListParagraph"/>
+      </w:pPr>
+      <w:r>
+        <w:t>Case study review pipeline: submitted → under review → approved → published</w:t>
+      </w:r>
+    </w:p>
+    <w:p>
+      <w:pPr>
+        <w:pStyle w:val="ListParagraph"/>
+      </w:pPr>
+      <w:r>
+        <w:t>LMS Progress tracking: view all fellows' course completion rates</w:t>
+      </w:r>
+    </w:p>
+    <w:p>
+      <w:pPr>
+        <w:pStyle w:val="ListParagraph"/>
+      </w:pPr>
+      <w:r>
+        <w:t>Quarterly report generation: individual fellow reports and program-wide summaries in DOCX format</w:t>
+      </w:r>
+    </w:p>
+    <w:p>
+      <w:pPr>
+        <w:pStyle w:val="ListParagraph"/>
+      </w:pPr>
+      <w:r>
+        <w:t>Case review visibility: see all pending reviews across SRFs with status tracking</w:t>
+      </w:r>
+    </w:p>
+    <w:p>
+      <w:r/>
+    </w:p>
+    <w:p>
+      <w:pPr>
+        <w:pStyle w:val="Heading2"/>
+      </w:pPr>
+      <w:r>
+        <w:t>3.2.1 Data Scientist Interface</w:t>
+      </w:r>
+    </w:p>
+    <w:p>
+      <w:r>
+        <w:t>The Data Scientist portal provides specialized support for data analysis across the program:</w:t>
+      </w:r>
+    </w:p>
+    <w:p>
+      <w:pPr>
+        <w:pStyle w:val="ListParagraph"/>
+      </w:pPr>
+      <w:r>
+        <w:t>Dashboard with analysis overview, recent submissions, and fellows needing help</w:t>
+      </w:r>
+    </w:p>
+    <w:p>
+      <w:pPr>
+        <w:pStyle w:val="ListParagraph"/>
+      </w:pPr>
+      <w:r>
+        <w:t>Analysis submissions: upload data analysis reports, visualizations, and statistical findings with ISB OneDrive links</w:t>
+      </w:r>
+    </w:p>
+    <w:p>
+      <w:pPr>
+        <w:pStyle w:val="ListParagraph"/>
+      </w:pPr>
+      <w:r>
+        <w:t>Work logs for tracking analysis activities</w:t>
+      </w:r>
+    </w:p>
+    <w:p>
+      <w:pPr>
+        <w:pStyle w:val="ListParagraph"/>
+      </w:pPr>
+      <w:r>
+        <w:t>Case studies: submit and view research findings</w:t>
+      </w:r>
+    </w:p>
+    <w:p>
+      <w:pPr>
+        <w:pStyle w:val="ListParagraph"/>
+      </w:pPr>
+      <w:r>
+        <w:t>Fellow Activity: browse all program fellows, see their logs, and offer data support</w:t>
+      </w:r>
+    </w:p>
+    <w:p>
+      <w:pPr>
+        <w:pStyle w:val="ListParagraph"/>
+      </w:pPr>
+      <w:r>
+        <w:t>Notification inbox: receive help requests from fellows</w:t>
+      </w:r>
+    </w:p>
+    <w:p>
+      <w:pPr>
+        <w:pStyle w:val="ListParagraph"/>
+      </w:pPr>
+      <w:r>
+        <w:t>Support requests and LMS course access</w:t>
+      </w:r>
+    </w:p>
+    <w:p>
+      <w:r/>
+    </w:p>
+    <w:p>
+      <w:pPr>
+        <w:pStyle w:val="Heading2"/>
+      </w:pPr>
+      <w:r>
+        <w:t>3.2.2 Senior Research Fellow (SRF) Interface</w:t>
+      </w:r>
+    </w:p>
+    <w:p>
+      <w:r>
+        <w:t>The SRF portal provides research oversight and case review capabilities:</w:t>
+      </w:r>
+    </w:p>
+    <w:p>
+      <w:pPr>
+        <w:pStyle w:val="ListParagraph"/>
+      </w:pPr>
+      <w:r>
+        <w:t>Dashboard with research overview, mentored fellows status, and compliance</w:t>
+      </w:r>
+    </w:p>
+    <w:p>
+      <w:pPr>
+        <w:pStyle w:val="ListParagraph"/>
+      </w:pPr>
+      <w:r>
+        <w:t>Research submissions: upload research papers, policy briefs, and field breakthroughs with ISB OneDrive links</w:t>
+      </w:r>
+    </w:p>
+    <w:p>
+      <w:pPr>
+        <w:pStyle w:val="ListParagraph"/>
+      </w:pPr>
+      <w:r>
+        <w:t>Work logs for tracking research activities</w:t>
+      </w:r>
+    </w:p>
+    <w:p>
+      <w:pPr>
+        <w:pStyle w:val="ListParagraph"/>
+      </w:pPr>
+      <w:r>
+        <w:t>Case Studies for Review: view all fellow-submitted cases, approve or return with comments</w:t>
+      </w:r>
+    </w:p>
+    <w:p>
+      <w:pPr>
+        <w:pStyle w:val="ListParagraph"/>
+      </w:pPr>
+      <w:r>
+        <w:t>Review workflow: submitted → under review → approved → published, with reviewer tracking</w:t>
+      </w:r>
+    </w:p>
+    <w:p>
+      <w:pPr>
+        <w:pStyle w:val="ListParagraph"/>
+      </w:pPr>
+      <w:r>
+        <w:t>Fellow Activity: browse fellows, view compliance, provide guidance</w:t>
+      </w:r>
+    </w:p>
+    <w:p>
+      <w:pPr>
+        <w:pStyle w:val="ListParagraph"/>
+      </w:pPr>
+      <w:r>
+        <w:t>Notification inbox: receive help requests from fellows</w:t>
+      </w:r>
+    </w:p>
+    <w:p>
+      <w:pPr>
+        <w:pStyle w:val="ListParagraph"/>
+      </w:pPr>
+      <w:r>
+        <w:t>Support requests and LMS course access</w:t>
+      </w:r>
+    </w:p>
+    <w:p>
+      <w:pPr>
+        <w:pStyle w:val="ListParagraph"/>
+      </w:pPr>
+      <w:r>
+        <w:t>Cross-program compliance dashboard with real-time metrics</w:t>
+      </w:r>
+    </w:p>
+    <w:p>
+      <w:pPr>
+        <w:pStyle w:val="ListParagraph"/>
+      </w:pPr>
+      <w:r>
+        <w:t>Weekly compliance trends and category distribution charts</w:t>
+      </w:r>
+    </w:p>
+    <w:p>
+      <w:pPr>
+        <w:pStyle w:val="ListParagraph"/>
+      </w:pPr>
+      <w:r>
+        <w:t>Support request oversight across all districts</w:t>
+      </w:r>
+    </w:p>
+    <w:p>
+      <w:pPr>
+        <w:pStyle w:val="ListParagraph"/>
+      </w:pPr>
+      <w:r>
+        <w:t>Case study review across all programs</w:t>
+      </w:r>
+    </w:p>
+    <w:p>
+      <w:pPr>
+        <w:pStyle w:val="ListParagraph"/>
+      </w:pPr>
+      <w:r>
+        <w:t>Silent fellow alerts with 3-day threshold</w:t>
+      </w:r>
+    </w:p>
+    <w:p>
+      <w:pPr>
+        <w:pStyle w:val="ListParagraph"/>
+      </w:pPr>
+      <w:r>
+        <w:t>User management: approve, reject, assign roles (Fellow, Data Scientist, SRF, Coordinator, Director), set districts/constituencies</w:t>
+      </w:r>
+    </w:p>
+    <w:p>
+      <w:pPr>
+        <w:pStyle w:val="ListParagraph"/>
+      </w:pPr>
+      <w:r>
+        <w:t>Role-based access: Data Scientists and SRFs are program-wide (no district assignment)</w:t>
+      </w:r>
+    </w:p>
+    <w:p>
+      <w:pPr>
+        <w:pStyle w:val="ListParagraph"/>
+      </w:pPr>
+      <w:r>
+        <w:t>LMS course management: add/edit/delete course links with program filtering</w:t>
+      </w:r>
+    </w:p>
+    <w:p>
+      <w:pPr>
+        <w:pStyle w:val="ListParagraph"/>
+      </w:pPr>
+      <w:r>
+        <w:t>Dashboard with program-scoped stats: fellow count, active users, compliance, support requests</w:t>
+      </w:r>
+    </w:p>
+    <w:p>
+      <w:pPr>
+        <w:pStyle w:val="ListParagraph"/>
+      </w:pPr>
+      <w:r>
+        <w:t>Case review pipeline visibility across all SRFs</w:t>
+      </w:r>
+    </w:p>
+    <w:p>
+      <w:pPr>
+        <w:pStyle w:val="ListParagraph"/>
+      </w:pPr>
+      <w:r>
+        <w:t>Quarterly report generation for individual fellows and program summaries</w:t>
+      </w:r>
+    </w:p>
+    <w:p>
+      <w:r>
+        <w:t>Version 2.0 — July 2026</w:t>
+      </w:r>
+    </w:p>
+    <w:p>
+      <w:pPr>
+        <w:pStyle w:val="ListParagraph"/>
+      </w:pPr>
+      <w:r>
+        <w:t>Added Data Scientist and SRF portals with role-based theming</w:t>
+      </w:r>
+    </w:p>
+    <w:p>
+      <w:pPr>
+        <w:pStyle w:val="ListParagraph"/>
+      </w:pPr>
+      <w:r>
+        <w:t>Added quarterly report generation (DOCX format)</w:t>
+      </w:r>
+    </w:p>
+    <w:p>
+      <w:pPr>
+        <w:pStyle w:val="ListParagraph"/>
+      </w:pPr>
+      <w:r>
+        <w:t>Added notification system for cross-role communication</w:t>
+      </w:r>
+    </w:p>
+    <w:p>
+      <w:pPr>
+        <w:pStyle w:val="ListParagraph"/>
+      </w:pPr>
+      <w:r>
+        <w:t>Added case study review workflow with SRF approval</w:t>
+      </w:r>
+    </w:p>
+    <w:p>
+      <w:pPr>
+        <w:pStyle w:val="ListParagraph"/>
+      </w:pPr>
+      <w:r>
+        <w:t>Added coordinator LMS progress tracking</w:t>
+      </w:r>
+    </w:p>
+    <w:p>
+      <w:pPr>
+        <w:pStyle w:val="ListParagraph"/>
+      </w:pPr>
+      <w:r>
+        <w:t>Added ISB OneDrive link support for document uploads</w:t>
+      </w:r>
+    </w:p>
+    <w:p>
+      <w:pPr>
+        <w:pStyle w:val="ListParagraph"/>
+      </w:pPr>
+      <w:r>
+        <w:t>Redesigned login page with Apple-inspired hero animations</w:t>
+      </w:r>
+    </w:p>
+    <w:p>
+      <w:pPr>
+        <w:pStyle w:val="ListParagraph"/>
+      </w:pPr>
+      <w:r>
+        <w:t>Added role-based color theming for all dashboards</w:t>
+      </w:r>
+    </w:p>
+    <w:p>
+      <w:pPr>
+        <w:pStyle w:val="ListParagraph"/>
+      </w:pPr>
+      <w:r>
+        <w:t>Fixed Firestore security rules and added composite indexes</w:t>
+      </w:r>
+    </w:p>
+    <w:p>
+      <w:pPr>
+        <w:pStyle w:val="ListParagraph"/>
+      </w:pPr>
+      <w:r>
+        <w:t>Fixed admin dashboard to correctly count fellows vs coordinators</w:t>
+      </w:r>
+    </w:p>
+    <w:p>
+      <w:pPr>
+        <w:pStyle w:val="ListParagraph"/>
+      </w:pPr>
+      <w:r>
+        <w:t>Standardized inactivity threshold to 3 days across all roles</w:t>
+      </w:r>
+    </w:p>
+    <w:p>
+      <w:pPr>
+        <w:pStyle w:val="ListParagraph"/>
+      </w:pPr>
+      <w:r>
+        <w:t>Updated copyright to Bharti Institute of Public Policy</w:t>
+      </w:r>
+    </w:p>
+    <w:p>
+      <w:r/>
+    </w:p>
+    <w:p>
+      <w:r>
+        <w:t>Version 1.0 — July 2026</w:t>
+      </w:r>
+    </w:p>
+    <w:p>
+      <w:pPr>
+        <w:pStyle w:val="ListParagraph"/>
+      </w:pPr>
+      <w:r>
+        <w:t>Initial platform launch with Fellow, Coordinator, Director, and Admin interfaces</w:t>
+      </w:r>
+    </w:p>
+    <w:p>
+      <w:pPr>
+        <w:pStyle w:val="ListParagraph"/>
+      </w:pPr>
+      <w:r>
+        <w:t>Google OAuth and email OTP authentication</w:t>
+      </w:r>
+    </w:p>
+    <w:p>
+      <w:pPr>
+        <w:pStyle w:val="ListParagraph"/>
+      </w:pPr>
+      <w:r>
+        <w:t>Firestore offline persistence for remote areas</w:t>
+      </w:r>
+    </w:p>
+    <w:p>
+      <w:pPr>
+        <w:pStyle w:val="ListParagraph"/>
+      </w:pPr>
+      <w:r>
+        <w:t>Work log tracking with voice-to-text input</w:t>
+      </w:r>
+    </w:p>
+    <w:p>
+      <w:pPr>
+        <w:pStyle w:val="ListParagraph"/>
+      </w:pPr>
+      <w:r>
+        <w:t>Support request system with escalation</w:t>
+      </w:r>
+    </w:p>
+    <w:p>
+      <w:pPr>
+        <w:pStyle w:val="ListParagraph"/>
+      </w:pPr>
+      <w:r>
+        <w:t>LMS course management</w:t>
       </w:r>
     </w:p>
     <w:sectPr>

</xml_diff>